<commit_message>
Add empirical fracture classifier results and paper
Co-authored-by: Copilot <223556219+Copilot@users.noreply.github.com>
</commit_message>
<xml_diff>
--- a/docs/Bone_Fracture_WSSS_IEOM_Draft.docx
+++ b/docs/Bone_Fracture_WSSS_IEOM_Draft.docx
@@ -16,7 +16,7 @@
           <w:color w:val="000000"/>
           <w:sz w:val="36"/>
         </w:rPr>
-        <w:t>Weakly Supervised Bone Fracture Segmentation and Pseudo Mask Generation from X-Ray Images Using Deep Learning</w:t>
+        <w:t>A Transfer-Learning Baseline for Bone Fracture Classification from X-Ray Images: A Single-Source Study</w:t>
       </w:r>
     </w:p>
     <w:p>
@@ -118,7 +118,7 @@
           <w:color w:val="000000"/>
           <w:sz w:val="20"/>
         </w:rPr>
-        <w:t>Weakly supervised segmentation may reduce pixel-level annotation demands in bone-fracture X-ray analysis, but class activation maps (CAMs) provide coarse evidence rather than fracture boundaries. This paper defines a reproducible pipeline for transfer-learning classification, Grad-CAM, Grad-CAM++, and LayerCAM localization, validation-only threshold selection, and optional U-Net training on pseudo-masks. The current repository audit identified 1,927 labeled images from one class-folder source, representing 1,897 exact image hashes. No expert pixel masks, patient identifiers, or trained model results are currently available in the checkout. Accordingly, this manuscript reports the protocol and data status only; it makes no performance claims. A held-out FracAtlas evaluation, multiple-seed experiments, confidence intervals, and baseline comparisons remain necessary before submission. The implementation groups exact duplicates, keeps test-threshold selection separate from validation, and records source-level audit information. Near-duplicate and patient-level leakage remain unresolved without additional metadata.</w:t>
+        <w:t>We trained an ImageNet-initialized ResNet-50 to classify fractured versus non-fractured radiographs using the single image-folder source available in this repository. The audited collection contained 1,927 files and 1,897 unique exact-image hashes; patient identifiers and expert pixel masks were unavailable. Exact duplicates were grouped, and checkpoint selection used validation fracture-class area under the ROC curve (AUC). One seed was run for 10 epochs at 224 by 224 pixels. On the untouched test split (n=391; 193 fractured, 198 non-fractured), accuracy was 0.506 [0.460, 0.555], fracture precision was 0.500 [0.438, 0.566], fracture recall was 0.637 [0.571, 0.702], F1 was 0.560 [0.506, 0.615], and AUC was 0.508 [0.451, 0.565]; brackets give 95% exact-hash-group bootstrap intervals. These preliminary internal results do not establish external validity or clinical utility. Because no expert masks were available, this study reports no segmentation or localization performance.</w:t>
       </w:r>
     </w:p>
     <w:p>
@@ -152,7 +152,7 @@
           <w:color w:val="000000"/>
           <w:sz w:val="20"/>
         </w:rPr>
-        <w:t>Weak supervision, bone fracture, X-ray imaging, class activation maps, pseudo-masks</w:t>
+        <w:t>Bone fracture, X-ray imaging, transfer learning, image classification, ResNet-50</w:t>
       </w:r>
     </w:p>
     <w:p>
@@ -169,7 +169,7 @@
           <w:color w:val="000000"/>
           <w:sz w:val="18"/>
         </w:rPr>
-        <w:t>Protocol and status draft. Not ready for submission until the marked experiments and author details are completed.</w:t>
+        <w:t>Preliminary empirical draft. Dataset provenance, additional seeds, external validation, and author details require verification before submission.</w:t>
       </w:r>
     </w:p>
     <w:p>
@@ -238,7 +238,7 @@
           <w:color w:val="000000"/>
           <w:sz w:val="20"/>
         </w:rPr>
-        <w:t>The repository at the time of this audit contains one labeled image-folder source and no expert masks or patient identifiers. The experiment described here is consequently a protocol and implementation report. Numerical results are intentionally withheld until the required datasets and evaluations are complete.</w:t>
+        <w:t>The repository at the time of this audit contains one labeled image-folder source and no expert masks or patient identifiers. We therefore evaluate image-level classification only and treat the results as an initial within-source baseline rather than evidence for fracture localization or clinical use.</w:t>
       </w:r>
     </w:p>
     <w:p>
@@ -273,7 +273,7 @@
           <w:color w:val="000000"/>
           <w:sz w:val="20"/>
         </w:rPr>
-        <w:t>The study will (1) compare ResNet-50 and DenseNet-121 fracture classifiers; (2) compare Grad-CAM, Grad-CAM++, and LayerCAM pseudo-masks using validation-selected thresholds; (3) measure localization against expert masks on a held-out FracAtlas split; (4) compare pseudo-mask-trained U-Net results with real-mask and trivial baselines; and (5) assess data leakage and image-statistic shortcuts. These objectives remain pending empirical completion.</w:t>
+        <w:t>This initial experiment trains one ImageNet-initialized ResNet-50 with image-level labels, selects its checkpoint using validation AUC, and measures classification once on the existing held-out test split. It also audits exact duplicate leakage and reports a low-level image-statistics diagnostic. DenseNet comparisons, CAM localization against expert annotations, pseudo-mask segmentation, multiple-seed analysis, and external validation are future work.</w:t>
       </w:r>
     </w:p>
     <w:p>
@@ -342,7 +342,7 @@
           <w:color w:val="000000"/>
           <w:sz w:val="20"/>
         </w:rPr>
-        <w:t>Shortcut learning describes models that exploit predictive but non-causal cues and fail under changed conditions (Geirhos et al. 2020). For radiographs, source, acquisition, and image processing artifacts can correlate with labels. The planned low-level image-statistics baseline is a warning screen, not proof that a model is unbiased. Exact duplicate hashes reduce one form of leakage, but they cannot replace patient or study grouping. Threshold selection follows validation-only practice; Otsu thresholding is included as an unsupervised comparator (Otsu 1979). Confidence intervals will be estimated by bootstrapping independent hash groups rather than individual duplicate files (Efron 1979).</w:t>
+        <w:t>Shortcut learning describes models that exploit predictive but non-causal cues and fail under changed conditions (Geirhos et al. 2020). For radiographs, source, acquisition, and image processing artifacts can correlate with labels. A low-level image-statistics baseline is a warning screen, not proof that a model is unbiased. Exact duplicate hashes reduce one form of leakage, but they cannot replace patient or study grouping. Threshold selection follows validation-only practice; Otsu thresholding is included as an unsupervised comparator (Otsu 1979). Confidence intervals are estimated by bootstrapping independent hash groups rather than individual duplicate files (Efron 1979).</w:t>
       </w:r>
     </w:p>
     <w:p>
@@ -705,7 +705,7 @@
           <w:color w:val="000000"/>
           <w:sz w:val="20"/>
         </w:rPr>
-        <w:t>The preparation script inventories image files in class-named directories, computes SHA-256 hashes, preserves an existing train/validation/test assignment when every exact-duplicate group agrees, and assigns a deterministic grouped split if it does not. Exact duplicates are kept together and collapsed to one sample for model training. The current audit found zero exact-hash groups crossing splits and zero duplicate groups with conflicting labels. Patient or study identifiers are absent, so exact-hash grouping does not rule out near-duplicate or patient-level leakage. All counts and exclusion rules should be rerun after adding sources.</w:t>
+        <w:t>The preparation script inventories image files in class-named directories, computes SHA-256 hashes, preserves an existing train/validation/test assignment when every exact-duplicate group agrees, and assigns a deterministic grouped split if it does not. Exact duplicates are kept together and collapsed to one sample for model training and evaluation. The audit found zero exact-hash groups crossing splits and zero duplicate groups with conflicting labels. Patient or study identifiers are absent, so this check does not rule out near-duplicate or patient-level leakage.</w:t>
       </w:r>
     </w:p>
     <w:p>
@@ -740,7 +740,7 @@
           <w:color w:val="000000"/>
           <w:sz w:val="20"/>
         </w:rPr>
-        <w:t>The implemented classifier candidates are ResNet-50 and DenseNet-121 initialized from ImageNet weights, with a new two-class output head. Grayscale radiographs are replicated to three channels, resized to 448 by 448 pixels, and normalized with ImageNet channel statistics. Training uses class-balanced sampling and AdamW. The classifier head is warmed up for two epochs before fine-tuning the full model. The default run is 20 epochs, with the checkpoint selected by validation AUC when both validation classes are present, otherwise by validation F1. The test split is not used for checkpoint selection. Three independent seeds are required for reported comparisons.</w:t>
+        <w:t>We trained an ImageNet-pretrained ResNet-50 with a new two-class output head. Grayscale images were converted to three channels, resized to 224 by 224 pixels, and normalized with ImageNet statistics. Class-balanced sampling and AdamW were used (head learning rate 1e-3, backbone learning rate 1e-5, weight decay 1e-4, batch size 16). The head was warmed up for two epochs, followed by full-model fine-tuning; training ran for 10 epochs with seed 0. The selected checkpoint was epoch 5, chosen by validation fracture-class AUC. The run used Python 3.14.8, PyTorch 2.14.1+cpu, and torchvision 0.29.1+cpu on cpu. The test split was not used for checkpoint selection.</w:t>
       </w:r>
     </w:p>
     <w:p>
@@ -775,7 +775,7 @@
           <w:color w:val="000000"/>
           <w:sz w:val="20"/>
         </w:rPr>
-        <w:t>The final convolutional block is used to compute Grad-CAM, Grad-CAM++, or LayerCAM for the fracture logit. Optional horizontal-flip test-time averaging combines the original map with the spatially reversed map. CAMs are normalized per image and saved with a manifest index. Global thresholds are swept on validation masks only; Otsu and percentile thresholds are available as alternatives. Binary masks receive 3 by 3 morphological opening and closing. CAMs are classifier evidence maps, so their thresholded outputs are treated as noisy pseudo-labels rather than anatomical ground truth.</w:t>
+        <w:t>Although the repository contains CAM and pseudo-mask utilities, CAMs were not generated or evaluated in this experiment. The data audit found no candidate pixel masks, so there was no expert localization target for threshold selection, Dice/IoU evaluation, or U-Net training. No segmentation result is claimed.</w:t>
       </w:r>
     </w:p>
     <w:p>
@@ -810,7 +810,7 @@
           <w:color w:val="000000"/>
           <w:sz w:val="20"/>
         </w:rPr>
-        <w:t>Classification reporting will include fracture-class AUC, accuracy, precision, recall, and F1 by source. Localization reporting will include Dice, IoU, precision, recall, and pointing-game accuracy on expert masks. Dice and F1 are algebraically equivalent for binary pixel labels; only Dice will be used for mask overlap. Empty-mask conventions are fixed in the implementation and must be reported with results. Confidence intervals will use 2,000 bootstrap resamples over exact-hash groups. Because patient IDs are unavailable, intervals will not represent patient-level sampling uncertainty. Thresholds will be selected on validation only and applied once to the held-out test split.</w:t>
+        <w:t>The fracture class was treated as positive, with a fixed probability threshold of 0.5. We report accuracy, fracture precision, recall, F1, and ROC AUC. The held-out test metrics are accompanied by percentile 95% confidence intervals from 2,000 bootstrap resamples of exact-hash groups. Since patient IDs are unavailable, these intervals do not quantify patient-level sampling uncertainty. The test set was evaluated once after checkpoint selection; it was not used to tune a classification threshold.</w:t>
       </w:r>
     </w:p>
     <w:p>
@@ -845,7 +845,7 @@
           <w:color w:val="000000"/>
           <w:sz w:val="20"/>
         </w:rPr>
-        <w:t>A compact U-Net is implemented for paired binary masks. It can be trained on pseudo-masks or supplied expert masks, but its validation score is agreement with the supplied labels and is not an expert-mask score when pseudo-labels are used. Planned comparisons are a pseudo-mask-trained U-Net, a real-mask-trained upper-bound model, an empty-mask baseline, a central-ellipse baseline, and a deterministic random-mask baseline. Dice loss follows the common soft-overlap formulation used in medical image segmentation (Milletari et al., 2016). These comparisons cannot be run on the current checkout because it contains no expert masks.</w:t>
+        <w:t>No segmentation baseline was trained. The available image labels are not pixel-level supervision, and creating pseudo-masks without expert masks would not permit a valid localization evaluation. U-Net and mask-baseline comparisons are deferred until an annotated, verified dataset is available.</w:t>
       </w:r>
     </w:p>
     <w:p>
@@ -863,7 +863,7 @@
           <w:color w:val="000000"/>
           <w:sz w:val="24"/>
         </w:rPr>
-        <w:t>4. Results and Discussion</w:t>
+        <w:t>4. Results</w:t>
       </w:r>
     </w:p>
     <w:p>
@@ -880,7 +880,7 @@
           <w:color w:val="000000"/>
           <w:sz w:val="20"/>
         </w:rPr>
-        <w:t>No model training or expert-mask evaluation has been run in this workspace. The available Python runtime does not contain PyTorch, torchvision, scikit-learn, OpenCV, or matplotlib, and the repository contains no pixel masks. Table 2 is a completion ledger, not a results table. Values must be populated from saved outputs after the required experiments; estimated or illustrative values must not be substituted.</w:t>
+        <w:t>The best validation checkpoint was selected at epoch 5. The held-out test set contained 391 unique images: 193 fractured and 198 non-fractured; its validation fracture-class AUC was 0.713. Table 2 reports the fixed-threshold classification results. Confidence intervals resample exact-image hash groups, not patients.</w:t>
       </w:r>
     </w:p>
     <w:tbl>
@@ -922,7 +922,7 @@
                 <w:color w:val="FFFFFF"/>
                 <w:sz w:val="18"/>
               </w:rPr>
-              <w:t>Analysis</w:t>
+              <w:t>Metric</w:t>
             </w:r>
           </w:p>
         </w:tc>
@@ -945,7 +945,7 @@
                 <w:color w:val="FFFFFF"/>
                 <w:sz w:val="18"/>
               </w:rPr>
-              <w:t>Current status</w:t>
+              <w:t>Test estimate</w:t>
             </w:r>
           </w:p>
         </w:tc>
@@ -968,7 +968,7 @@
                 <w:color w:val="FFFFFF"/>
                 <w:sz w:val="18"/>
               </w:rPr>
-              <w:t>Required evidence</w:t>
+              <w:t>95% group-bootstrap interval</w:t>
             </w:r>
           </w:p>
         </w:tc>
@@ -992,7 +992,7 @@
                 <w:color w:val="000000"/>
                 <w:sz w:val="18"/>
               </w:rPr>
-              <w:t>Classifier AUC by source and seed</w:t>
+              <w:t>Accuracy</w:t>
             </w:r>
           </w:p>
         </w:tc>
@@ -1014,7 +1014,7 @@
                 <w:color w:val="000000"/>
                 <w:sz w:val="18"/>
               </w:rPr>
-              <w:t>Not run</w:t>
+              <w:t>0.506</w:t>
             </w:r>
           </w:p>
         </w:tc>
@@ -1036,7 +1036,7 @@
                 <w:color w:val="000000"/>
                 <w:sz w:val="18"/>
               </w:rPr>
-              <w:t>Trained checkpoints and held-out predictions</w:t>
+              <w:t>[0.460, 0.555]</w:t>
             </w:r>
           </w:p>
         </w:tc>
@@ -1061,7 +1061,7 @@
                 <w:color w:val="000000"/>
                 <w:sz w:val="18"/>
               </w:rPr>
-              <w:t>CAM Dice/IoU and pointing game</w:t>
+              <w:t>Fracture precision</w:t>
             </w:r>
           </w:p>
         </w:tc>
@@ -1084,7 +1084,7 @@
                 <w:color w:val="000000"/>
                 <w:sz w:val="18"/>
               </w:rPr>
-              <w:t>Not available</w:t>
+              <w:t>0.500</w:t>
             </w:r>
           </w:p>
         </w:tc>
@@ -1107,7 +1107,7 @@
                 <w:color w:val="000000"/>
                 <w:sz w:val="18"/>
               </w:rPr>
-              <w:t>Verified expert masks; validation and test outputs</w:t>
+              <w:t>[0.438, 0.566]</w:t>
             </w:r>
           </w:p>
         </w:tc>
@@ -1131,7 +1131,7 @@
                 <w:color w:val="000000"/>
                 <w:sz w:val="18"/>
               </w:rPr>
-              <w:t>Threshold and backbone ablations</w:t>
+              <w:t>Fracture recall</w:t>
             </w:r>
           </w:p>
         </w:tc>
@@ -1153,7 +1153,7 @@
                 <w:color w:val="000000"/>
                 <w:sz w:val="18"/>
               </w:rPr>
-              <w:t>Not run</w:t>
+              <w:t>0.637</w:t>
             </w:r>
           </w:p>
         </w:tc>
@@ -1175,7 +1175,7 @@
                 <w:color w:val="000000"/>
                 <w:sz w:val="18"/>
               </w:rPr>
-              <w:t>Three seeds; validation-selected threshold</w:t>
+              <w:t>[0.571, 0.702]</w:t>
             </w:r>
           </w:p>
         </w:tc>
@@ -1200,7 +1200,7 @@
                 <w:color w:val="000000"/>
                 <w:sz w:val="18"/>
               </w:rPr>
-              <w:t>Pseudo-mask vs real-mask U-Net</w:t>
+              <w:t>Fracture F1</w:t>
             </w:r>
           </w:p>
         </w:tc>
@@ -1223,7 +1223,7 @@
                 <w:color w:val="000000"/>
                 <w:sz w:val="18"/>
               </w:rPr>
-              <w:t>Not available</w:t>
+              <w:t>0.560</w:t>
             </w:r>
           </w:p>
         </w:tc>
@@ -1246,7 +1246,7 @@
                 <w:color w:val="000000"/>
                 <w:sz w:val="18"/>
               </w:rPr>
-              <w:t>Expert-mask train/validation/test partitions</w:t>
+              <w:t>[0.506, 0.615]</w:t>
             </w:r>
           </w:p>
         </w:tc>
@@ -1270,7 +1270,7 @@
                 <w:color w:val="000000"/>
                 <w:sz w:val="18"/>
               </w:rPr>
-              <w:t>Shortcut and trivial baselines</w:t>
+              <w:t>Fracture ROC AUC</w:t>
             </w:r>
           </w:p>
         </w:tc>
@@ -1292,7 +1292,7 @@
                 <w:color w:val="000000"/>
                 <w:sz w:val="18"/>
               </w:rPr>
-              <w:t>Not run</w:t>
+              <w:t>0.508</w:t>
             </w:r>
           </w:p>
         </w:tc>
@@ -1314,7 +1314,7 @@
                 <w:color w:val="000000"/>
                 <w:sz w:val="18"/>
               </w:rPr>
-              <w:t>Audit CSV and expert-mask baseline CSV</w:t>
+              <w:t>[0.451, 0.565]</w:t>
             </w:r>
           </w:p>
         </w:tc>
@@ -1380,7 +1380,7 @@
           <w:color w:val="000000"/>
           <w:sz w:val="18"/>
         </w:rPr>
-        <w:t>Figure 1: Image counts by existing split and class in the repository dataset; these are inventory counts, not model results.</w:t>
+        <w:t>Figure 1: Image counts by existing split and class in the repository dataset; counts are inventory, not model results.</w:t>
       </w:r>
     </w:p>
     <w:p>
@@ -1397,7 +1397,7 @@
           <w:color w:val="000000"/>
           <w:sz w:val="20"/>
         </w:rPr>
-        <w:t>No classifier or segmentation model was run for this paper. ResNet-50 and DenseNet-121 are implemented as candidate classifiers, and a compact U-Net is implemented as a segmentation baseline, but the required PyTorch runtime and expert masks were unavailable. The plotted values describe only the indexed image files.</w:t>
+        <w:t>No CAM, mask-overlap, or segmentation results are available because expert pixel masks were not found. The classification metrics are an internal held-out estimate from one source and one seed, not a clinical performance claim.</w:t>
       </w:r>
     </w:p>
     <w:p>
@@ -1432,7 +1432,7 @@
           <w:color w:val="000000"/>
           <w:sz w:val="20"/>
         </w:rPr>
-        <w:t>The present repository supports a leakage-aware classification and localization workflow, but it does not yet support an empirical claim about fracture segmentation quality. The main contribution at this stage is a reproducible protocol that separates validation threshold selection from final test evaluation and makes the data limitations visible. A completed study should compare CAM methods within the same source and split, report source-specific classification behavior, and show successful and failed localization overlays. It should also compare the learned maps with simple baselines and investigate whether image-level acquisition cues predict labels.</w:t>
+        <w:t>The experiment provides a reproducible transfer-learning baseline on the single source available in this checkout. The low-level image-statistics diagnostic achieved a validation AUC of 0.289. This one diagnostic did not predict the labels well in the expected direction, but it cannot establish that the learned classifier is free of shortcuts. Source artifacts, acquisition patterns, and near-duplicate studies remain possible confounders. Patient/study-level grouping and an independent external cohort are required to test generalization.</w:t>
       </w:r>
     </w:p>
     <w:p>
@@ -1449,7 +1449,7 @@
           <w:color w:val="000000"/>
           <w:sz w:val="20"/>
         </w:rPr>
-        <w:t>The low-resolution nature of CAMs may be poorly matched to narrow fracture structures. Mask overlap metrics should therefore be interpreted alongside pointing-game accuracy and representative overlays. Any use of the pseudo-mask trained U-Net must be evaluated against expert annotations on held-out images; agreement with its own pseudo-labels cannot establish clinical boundary accuracy. Results from different anatomical regions or sources should not be pooled without stratification.</w:t>
+        <w:t>The test metrics have uncertainty from image-group sampling, but a single random seed and a single existing split do not capture training variability or domain shift. The fixed 0.5 probability threshold was not tuned on the test set. Future classification work should repeat training over prespecified seeds, report calibration and per-source results, and evaluate prospectively or on an independent dataset. CAM visualizations, if generated, would remain qualitative until compared with audited expert masks.</w:t>
       </w:r>
     </w:p>
     <w:p>
@@ -1484,7 +1484,7 @@
           <w:color w:val="000000"/>
           <w:sz w:val="20"/>
         </w:rPr>
-        <w:t>The present dataset inventory contains a single source with undocumented provenance and no expert pixel masks. The source labels, image quality, class definitions, licensing, and collection protocol require verification. Exact hashes do not detect transformed near duplicates or repeated patients. The current code does not parse COCO polygons, use GRAZPEDWRI-DX bounding boxes, perform MedSAM refinement, train a pretrained ResNet-34 U-Net, or provide external validation. The runtime used for this work lacks the deep-learning dependencies needed to train the models. Therefore, no accuracy, localization, segmentation, robustness, or clinical utility claim is supported at this time.</w:t>
+        <w:t>The dataset contains one source with undocumented provenance, licensing, and collection protocol. It lacks patient identifiers and expert pixel masks; exact hashes do not identify transformed near duplicates or repeated patients. Only one model configuration and one seed were evaluated, and no independent external cohort, calibration analysis, or segmentation evaluation was performed. The image-folder labels and split construction require verification. The reported values therefore support only preliminary within-source classification research, not diagnostic use.</w:t>
       </w:r>
     </w:p>
     <w:p>
@@ -1519,7 +1519,7 @@
           <w:color w:val="000000"/>
           <w:sz w:val="20"/>
         </w:rPr>
-        <w:t>This manuscript defines a weakly supervised fracture localization pipeline and reports the exact data status of the current repository. The audit found 1,927 class-labeled images, 1,897 unique exact-image hashes, and no paired expert masks. The empirical study remains incomplete. Publication claims should be added only after the intended sources are documented, expert-mask pairs are validated, multi-seed experiments and baselines are run, and the held-out test set is evaluated once using thresholds selected on validation data.</w:t>
+        <w:t>An ImageNet-pretrained ResNet-50 was trained and evaluated for fracture classification on a single-source dataset, with test results of accuracy 0.506 and AUC 0.508. The audit found 1,927 image files, 1,897 unique exact-image hashes, and no expert masks. These preliminary findings require replication with multiple seeds and external data. Verified data provenance, patient-level splits, and expert annotations are prerequisites for any localization, segmentation, or clinical claim.</w:t>
       </w:r>
     </w:p>
     <w:p>
@@ -1554,7 +1554,7 @@
           <w:color w:val="000000"/>
           <w:sz w:val="20"/>
         </w:rPr>
-        <w:t>[Add only verified funding, facilities, or contributor acknowledgements.]</w:t>
+        <w:t>No external funding or acknowledgements were provided for this draft.</w:t>
       </w:r>
     </w:p>
     <w:p>

</xml_diff>

<commit_message>
Report train-only pseudo-mask U-Net results
Co-authored-by: Copilot <223556219+Copilot@users.noreply.github.com>
</commit_message>
<xml_diff>
--- a/docs/Bone_Fracture_WSSS_IEOM_Draft.docx
+++ b/docs/Bone_Fracture_WSSS_IEOM_Draft.docx
@@ -118,7 +118,7 @@
           <w:color w:val="000000"/>
           <w:sz w:val="20"/>
         </w:rPr>
-        <w:t>We trained an ImageNet-initialized ResNet-50 to classify fractured versus non-fractured radiographs using the single image-folder source available in this repository. The audited collection contained 1,927 files and 1,897 unique exact-image hashes; patient identifiers and expert pixel masks were unavailable. Exact duplicates were grouped, and checkpoint selection used validation fracture-class area under the ROC curve (AUC). One seed was run for 10 epochs at 224 by 224 pixels. On the untouched test split (n=391; 193 fractured, 198 non-fractured), accuracy was 0.506 [0.460, 0.555], fracture precision was 0.500 [0.438, 0.566], fracture recall was 0.637 [0.571, 0.702], F1 was 0.560 [0.506, 0.615], and AUC was 0.508 [0.451, 0.565]; brackets give 95% exact-hash-group bootstrap intervals. These preliminary internal results do not establish external validity or clinical utility. Because no expert masks were available, this study reports no segmentation or localization performance.</w:t>
+        <w:t>We trained an ImageNet-initialized ResNet-50 to classify fractured versus non-fractured radiographs using the single image-folder source available in this repository. The audited collection contained 1,927 files and 1,897 unique exact-image hashes; patient identifiers and expert pixel masks were unavailable. Exact duplicates were grouped, and checkpoint selection used validation fracture-class area under the ROC curve (AUC). One seed was run for 10 epochs at 224 by 224 pixels. On the untouched test split (n=391; 193 fractured, 198 non-fractured), accuracy was 0.506 [0.460, 0.555], fracture precision was 0.500 [0.438, 0.566], fracture recall was 0.637 [0.571, 0.702], F1 was 0.560 [0.506, 0.615], and AUC was 0.508 [0.451, 0.565]; brackets give 95% exact-hash-group bootstrap intervals. These preliminary internal results do not establish external validity or clinical utility. A U-Net was also trained on 918 training-only CAM pseudo-masks; its best validation Dice against held-out pseudo-masks was 0.378. This is pseudo-label agreement, not expert-mask segmentation performance.</w:t>
       </w:r>
     </w:p>
     <w:p>
@@ -238,7 +238,7 @@
           <w:color w:val="000000"/>
           <w:sz w:val="20"/>
         </w:rPr>
-        <w:t>The repository at the time of this audit contains one labeled image-folder source and no expert masks or patient identifiers. We therefore evaluate image-level classification only and treat the results as an initial within-source baseline rather than evidence for fracture localization or clinical use.</w:t>
+        <w:t>The repository at the time of this audit contains one labeled image-folder source and no expert masks or patient identifiers. We evaluate image-level classification and, separately, train a U-Net on training-only CAM pseudo-masks. Agreement with generated pseudo-masks is not evidence of fracture localization accuracy or clinical use.</w:t>
       </w:r>
     </w:p>
     <w:p>
@@ -273,7 +273,7 @@
           <w:color w:val="000000"/>
           <w:sz w:val="20"/>
         </w:rPr>
-        <w:t>This initial experiment trains one ImageNet-initialized ResNet-50 with image-level labels, selects its checkpoint using validation AUC, and measures classification once on the existing held-out test split. It also audits exact duplicate leakage and reports a low-level image-statistics diagnostic. DenseNet comparisons, CAM localization against expert annotations, pseudo-mask segmentation, multiple-seed analysis, and external validation are future work.</w:t>
+        <w:t>This initial experiment trains one ImageNet-initialized ResNet-50 with image-level labels, selects its checkpoint using validation AUC, and measures classification once on the existing held-out test split. It also audits exact duplicate leakage, reports a low-level image-statistics diagnostic, and trains a U-Net using only train-split CAM pseudo-masks. Expert-mask evaluation, DenseNet comparisons, multiple-seed analysis, and external validation remain future work.</w:t>
       </w:r>
     </w:p>
     <w:p>
@@ -775,7 +775,7 @@
           <w:color w:val="000000"/>
           <w:sz w:val="20"/>
         </w:rPr>
-        <w:t>Although the repository contains CAM and pseudo-mask utilities, CAMs were not generated or evaluated in this experiment. The data audit found no candidate pixel masks, so there was no expert localization target for threshold selection, Dice/IoU evaluation, or U-Net training. No segmentation result is claimed.</w:t>
+        <w:t>Grad-CAM maps from the trained classifier were generated only for the 918 unique training images and thresholded at 0.35 to create pseudo-masks. No validation or test images were used to generate training targets. These CAM-derived masks are noisy training labels, not expert annotations.</w:t>
       </w:r>
     </w:p>
     <w:p>
@@ -845,7 +845,7 @@
           <w:color w:val="000000"/>
           <w:sz w:val="20"/>
         </w:rPr>
-        <w:t>No segmentation baseline was trained. The available image labels are not pixel-level supervision, and creating pseudo-masks without expert masks would not permit a valid localization evaluation. U-Net and mask-baseline comparisons are deferred until an annotated, verified dataset is available.</w:t>
+        <w:t>A compact U-Net was trained on 734 training pseudo-mask pairs and selected using 184 validation pairs, split by exact-image hash from the original training set. The model used 128 by 128 grayscale inputs, batch size 8, seed 42, and three epochs. The held-out repository test split was excluded. Dice and IoU below quantify agreement with generated pseudo-labels only; expert-mask localization performance remains unmeasured.</w:t>
       </w:r>
     </w:p>
     <w:p>
@@ -1397,7 +1397,192 @@
           <w:color w:val="000000"/>
           <w:sz w:val="20"/>
         </w:rPr>
-        <w:t>No CAM, mask-overlap, or segmentation results are available because expert pixel masks were not found. The classification metrics are an internal held-out estimate from one source and one seed, not a clinical performance claim.</w:t>
+        <w:t>Table 3 reports U-Net validation agreement with held-out pseudo-masks; these values are not expert-mask segmentation metrics and should not be interpreted as localization accuracy.</w:t>
+      </w:r>
+    </w:p>
+    <w:tbl>
+      <w:tblPr>
+        <w:tblW w:type="auto" w:w="0"/>
+        <w:tblLayout w:type="fixed"/>
+        <w:tblLook w:firstColumn="1" w:firstRow="1" w:lastColumn="0" w:lastRow="0" w:noHBand="0" w:noVBand="1" w:val="04A0"/>
+        <w:tblBorders>
+          <w:top w:val="single" w:sz="4" w:space="0" w:color="D9D9D9"/>
+          <w:left w:val="single" w:sz="4" w:space="0" w:color="D9D9D9"/>
+          <w:bottom w:val="single" w:sz="4" w:space="0" w:color="D9D9D9"/>
+          <w:right w:val="single" w:sz="4" w:space="0" w:color="D9D9D9"/>
+          <w:insideH w:val="single" w:sz="4" w:space="0" w:color="D9D9D9"/>
+          <w:insideV w:val="single" w:sz="4" w:space="0" w:color="D9D9D9"/>
+        </w:tblBorders>
+      </w:tblPr>
+      <w:tblGrid>
+        <w:gridCol w:w="5760"/>
+        <w:gridCol w:w="2880"/>
+      </w:tblGrid>
+      <w:tr>
+        <w:tc>
+          <w:tcPr>
+            <w:tcW w:type="dxa" w:w="5760"/>
+            <w:vAlign w:val="center"/>
+            <w:shd w:fill="1F4E78"/>
+          </w:tcPr>
+          <w:p>
+            <w:pPr>
+              <w:spacing w:after="60"/>
+              <w:jc w:val="center"/>
+            </w:pPr>
+            <w:r>
+              <w:rPr>
+                <w:rFonts w:ascii="Times New Roman" w:hAnsi="Times New Roman" w:eastAsia="Times New Roman"/>
+                <w:b/>
+                <w:i w:val="0"/>
+                <w:color w:val="FFFFFF"/>
+                <w:sz w:val="18"/>
+              </w:rPr>
+              <w:t>Validation measure</w:t>
+            </w:r>
+          </w:p>
+        </w:tc>
+        <w:tc>
+          <w:tcPr>
+            <w:tcW w:type="dxa" w:w="2880"/>
+            <w:vAlign w:val="center"/>
+            <w:shd w:fill="1F4E78"/>
+          </w:tcPr>
+          <w:p>
+            <w:pPr>
+              <w:spacing w:after="60"/>
+              <w:jc w:val="center"/>
+            </w:pPr>
+            <w:r>
+              <w:rPr>
+                <w:rFonts w:ascii="Times New Roman" w:hAnsi="Times New Roman" w:eastAsia="Times New Roman"/>
+                <w:b/>
+                <w:i w:val="0"/>
+                <w:color w:val="FFFFFF"/>
+                <w:sz w:val="18"/>
+              </w:rPr>
+              <w:t>Best checkpoint</w:t>
+            </w:r>
+          </w:p>
+        </w:tc>
+      </w:tr>
+      <w:tr>
+        <w:tc>
+          <w:tcPr>
+            <w:tcW w:type="dxa" w:w="5760"/>
+            <w:vAlign w:val="center"/>
+          </w:tcPr>
+          <w:p>
+            <w:pPr>
+              <w:spacing w:after="60"/>
+              <w:jc w:val="left"/>
+            </w:pPr>
+            <w:r>
+              <w:rPr>
+                <w:rFonts w:ascii="Times New Roman" w:hAnsi="Times New Roman" w:eastAsia="Times New Roman"/>
+                <w:b w:val="0"/>
+                <w:i w:val="0"/>
+                <w:color w:val="000000"/>
+                <w:sz w:val="18"/>
+              </w:rPr>
+              <w:t>Dice against pseudo-masks</w:t>
+            </w:r>
+          </w:p>
+        </w:tc>
+        <w:tc>
+          <w:tcPr>
+            <w:tcW w:type="dxa" w:w="2880"/>
+            <w:vAlign w:val="center"/>
+          </w:tcPr>
+          <w:p>
+            <w:pPr>
+              <w:spacing w:after="60"/>
+              <w:jc w:val="left"/>
+            </w:pPr>
+            <w:r>
+              <w:rPr>
+                <w:rFonts w:ascii="Times New Roman" w:hAnsi="Times New Roman" w:eastAsia="Times New Roman"/>
+                <w:b w:val="0"/>
+                <w:i w:val="0"/>
+                <w:color w:val="000000"/>
+                <w:sz w:val="18"/>
+              </w:rPr>
+              <w:t>0.378</w:t>
+            </w:r>
+          </w:p>
+        </w:tc>
+      </w:tr>
+      <w:tr>
+        <w:tc>
+          <w:tcPr>
+            <w:tcW w:type="dxa" w:w="5760"/>
+            <w:vAlign w:val="center"/>
+            <w:shd w:fill="F2F6FA"/>
+          </w:tcPr>
+          <w:p>
+            <w:pPr>
+              <w:spacing w:after="60"/>
+              <w:jc w:val="left"/>
+            </w:pPr>
+            <w:r>
+              <w:rPr>
+                <w:rFonts w:ascii="Times New Roman" w:hAnsi="Times New Roman" w:eastAsia="Times New Roman"/>
+                <w:b w:val="0"/>
+                <w:i w:val="0"/>
+                <w:color w:val="000000"/>
+                <w:sz w:val="18"/>
+              </w:rPr>
+              <w:t>IoU against pseudo-masks</w:t>
+            </w:r>
+          </w:p>
+        </w:tc>
+        <w:tc>
+          <w:tcPr>
+            <w:tcW w:type="dxa" w:w="2880"/>
+            <w:vAlign w:val="center"/>
+            <w:shd w:fill="F2F6FA"/>
+          </w:tcPr>
+          <w:p>
+            <w:pPr>
+              <w:spacing w:after="60"/>
+              <w:jc w:val="left"/>
+            </w:pPr>
+            <w:r>
+              <w:rPr>
+                <w:rFonts w:ascii="Times New Roman" w:hAnsi="Times New Roman" w:eastAsia="Times New Roman"/>
+                <w:b w:val="0"/>
+                <w:i w:val="0"/>
+                <w:color w:val="000000"/>
+                <w:sz w:val="18"/>
+              </w:rPr>
+              <w:t>0.267</w:t>
+            </w:r>
+          </w:p>
+        </w:tc>
+      </w:tr>
+    </w:tbl>
+    <w:p>
+      <w:pPr>
+        <w:keepLines w:val="0"/>
+        <w:spacing w:before="0" w:after="40" w:line="240" w:lineRule="auto"/>
+        <w:jc w:val="both"/>
+      </w:pPr>
+    </w:p>
+    <w:p>
+      <w:pPr>
+        <w:keepLines w:val="0"/>
+        <w:spacing w:before="0" w:after="100" w:line="240" w:lineRule="auto"/>
+        <w:jc w:val="both"/>
+      </w:pPr>
+      <w:r>
+        <w:rPr>
+          <w:rFonts w:ascii="Times New Roman" w:hAnsi="Times New Roman" w:eastAsia="Times New Roman"/>
+          <w:b w:val="0"/>
+          <w:i w:val="0"/>
+          <w:color w:val="000000"/>
+          <w:sz w:val="20"/>
+        </w:rPr>
+        <w:t>No expert pixel masks were found, so true localization and segmentation accuracy remain unevaluated. The classification metrics are an internal held-out estimate from one source and one seed, not a clinical performance claim.</w:t>
       </w:r>
     </w:p>
     <w:p>
@@ -1454,6 +1639,23 @@
     </w:p>
     <w:p>
       <w:pPr>
+        <w:keepLines w:val="0"/>
+        <w:spacing w:before="0" w:after="100" w:line="240" w:lineRule="auto"/>
+        <w:jc w:val="both"/>
+      </w:pPr>
+      <w:r>
+        <w:rPr>
+          <w:rFonts w:ascii="Times New Roman" w:hAnsi="Times New Roman" w:eastAsia="Times New Roman"/>
+          <w:b w:val="0"/>
+          <w:i w:val="0"/>
+          <w:color w:val="000000"/>
+          <w:sz w:val="20"/>
+        </w:rPr>
+        <w:t>The U-Net validation scores measure fit to CAM-generated pseudo-labels, whose errors are inherited by the segmenter; they are not an independent assessment of fracture localization. Expert masks and a prespecified external evaluation are necessary before interpreting these maps as anatomical segmentation.</w:t>
+      </w:r>
+    </w:p>
+    <w:p>
+      <w:pPr>
         <w:keepNext/>
         <w:keepLines/>
         <w:spacing w:before="100" w:after="40" w:line="240" w:lineRule="auto"/>
@@ -1484,7 +1686,7 @@
           <w:color w:val="000000"/>
           <w:sz w:val="20"/>
         </w:rPr>
-        <w:t>The dataset contains one source with undocumented provenance, licensing, and collection protocol. It lacks patient identifiers and expert pixel masks; exact hashes do not identify transformed near duplicates or repeated patients. Only one model configuration and one seed were evaluated, and no independent external cohort, calibration analysis, or segmentation evaluation was performed. The image-folder labels and split construction require verification. The reported values therefore support only preliminary within-source classification research, not diagnostic use.</w:t>
+        <w:t>The dataset contains one source with undocumented provenance, licensing, and collection protocol. It lacks patient identifiers and expert pixel masks; exact hashes do not identify transformed near duplicates or repeated patients. Only one model configuration and one seed were evaluated, and no independent external cohort, calibration analysis, or expert-mask segmentation evaluation was performed. The image-folder labels and split construction require verification. The reported values therefore support only preliminary within-source classification research, not diagnostic use.</w:t>
       </w:r>
     </w:p>
     <w:p>
@@ -1519,7 +1721,7 @@
           <w:color w:val="000000"/>
           <w:sz w:val="20"/>
         </w:rPr>
-        <w:t>An ImageNet-pretrained ResNet-50 was trained and evaluated for fracture classification on a single-source dataset, with test results of accuracy 0.506 and AUC 0.508. The audit found 1,927 image files, 1,897 unique exact-image hashes, and no expert masks. These preliminary findings require replication with multiple seeds and external data. Verified data provenance, patient-level splits, and expert annotations are prerequisites for any localization, segmentation, or clinical claim.</w:t>
+        <w:t>An ImageNet-pretrained ResNet-50 was trained and evaluated for fracture classification on a single-source dataset, with test results of accuracy 0.506 and AUC 0.508. The audit found 1,927 image files, 1,897 unique exact-image hashes, and no expert masks. A U-Net trained on train-only CAM pseudo-masks achieved validation Dice 0.378 against held-out pseudo-labels, which is not an expert localization result. These preliminary findings require replication with multiple seeds and external data. Verified data provenance, patient-level splits, and expert annotations are prerequisites for any localization, segmentation, or clinical claim.</w:t>
       </w:r>
     </w:p>
     <w:p>

</xml_diff>